<commit_message>
fix: correct XML namespace for txbxContent text extraction and review fixes
- Fix critical namespace bug: txbxContent uses WordProcessingML elements
  (w:p/w:r/w:t), not DrawingML (a:p/a:r/a:t). Previous code matched the
  wrong namespace, working only with synthetic fixtures.
- Update fixture to generate correct w:p/w:r/w:t elements inside txbxContent
- Hoist etree.tostring() before inner txbxContent loop (was redundantly
  serializing the same drawing element per iteration)
- Move lxml imports to module level in extract.py and reconstruct.py
- Add interleaved block/style alignment test to protect against regressions
</commit_message>
<xml_diff>
--- a/tests/fixtures/textboxes.docx
+++ b/tests/fixtures/textboxes.docx
@@ -46,12 +46,11 @@
                     </a:ln>
                   </wps:spPr>
                   <wps:txbxContent>
-                    <a:p>
-                      <a:r>
-                        <a:rPr lang="en-US"/>
-                        <a:t>This is a simple text box.</a:t>
-                      </a:r>
-                    </a:p>
+                    <w:p>
+                      <w:r>
+                        <w:t>This is a simple text box.</w:t>
+                      </w:r>
+                    </w:p>
                   </wps:txbxContent>
                 </wps:wsp>
               </a:graphicData>
@@ -92,18 +91,19 @@
                     </a:ln>
                   </wps:spPr>
                   <wps:txbxContent>
-                    <a:p>
-                      <a:r>
-                        <a:rPr lang="en-US" b="1"/>
-                        <a:t>Bold heading inside text box</a:t>
-                      </a:r>
-                    </a:p>
-                    <a:p>
-                      <a:r>
-                        <a:rPr lang="en-US"/>
-                        <a:t>Regular paragraph in text box.</a:t>
-                      </a:r>
-                    </a:p>
+                    <w:p>
+                      <w:r>
+                        <w:rPr>
+                          <w:b/>
+                        </w:rPr>
+                        <w:t>Bold heading inside text box</w:t>
+                      </w:r>
+                    </w:p>
+                    <w:p>
+                      <w:r>
+                        <w:t>Regular paragraph in text box.</w:t>
+                      </w:r>
+                    </w:p>
                   </wps:txbxContent>
                 </wps:wsp>
               </a:graphicData>
@@ -142,12 +142,11 @@
                     </a:solidFill>
                   </wps:spPr>
                   <wps:txbxContent>
-                    <a:p>
-                      <a:r>
-                        <a:rPr lang="en-US"/>
-                        <a:t>Text inside a shape.</a:t>
-                      </a:r>
-                    </a:p>
+                    <w:p>
+                      <w:r>
+                        <w:t>Text inside a shape.</w:t>
+                      </w:r>
+                    </w:p>
                   </wps:txbxContent>
                 </wps:wsp>
               </a:graphicData>

</xml_diff>